<commit_message>
Updated outputs to include .tiff figures
</commit_message>
<xml_diff>
--- a/tables/table_S5/table_S5.docx
+++ b/tables/table_S5/table_S5.docx
@@ -299,7 +299,7 @@
                 <w:szCs w:val="22"/>
                 <w:color w:val="000000"/>
               </w:rPr>
-              <w:t xml:space="preserve">Redox disruption</w:t>
+              <w:t xml:space="preserve">AChE inhibition</w:t>
             </w:r>
           </w:p>
         </w:tc>
@@ -352,7 +352,7 @@
                 <w:szCs w:val="22"/>
                 <w:color w:val="000000"/>
               </w:rPr>
-              <w:t xml:space="preserve">39.144</w:t>
+              <w:t xml:space="preserve">41.590</w:t>
             </w:r>
             <w:r>
               <w:rPr>
@@ -376,7 +376,7 @@
                 <w:szCs w:val="22"/>
                 <w:color w:val="000000"/>
               </w:rPr>
-              <w:t xml:space="preserve">14.376</w:t>
+              <w:t xml:space="preserve">16.441</w:t>
             </w:r>
           </w:p>
         </w:tc>
@@ -436,7 +436,7 @@
                 <w:szCs w:val="22"/>
                 <w:color w:val="000000"/>
               </w:rPr>
-              <w:t xml:space="preserve">AChE inhibition</w:t>
+              <w:t xml:space="preserve">Oxidative phosphorylation inhibition (OXPHOS inhibition)</w:t>
             </w:r>
           </w:p>
         </w:tc>
@@ -489,7 +489,7 @@
                 <w:szCs w:val="22"/>
                 <w:color w:val="000000"/>
               </w:rPr>
-              <w:t xml:space="preserve">38.510</w:t>
+              <w:t xml:space="preserve">41.222</w:t>
             </w:r>
             <w:r>
               <w:rPr>
@@ -513,7 +513,7 @@
                 <w:szCs w:val="22"/>
                 <w:color w:val="000000"/>
               </w:rPr>
-              <w:t xml:space="preserve">17.077</w:t>
+              <w:t xml:space="preserve">13.666</w:t>
             </w:r>
           </w:p>
         </w:tc>
@@ -573,7 +573,7 @@
                 <w:szCs w:val="22"/>
                 <w:color w:val="000000"/>
               </w:rPr>
-              <w:t xml:space="preserve">Other|unknown</w:t>
+              <w:t xml:space="preserve">Redox cycling</w:t>
             </w:r>
           </w:p>
         </w:tc>
@@ -626,7 +626,7 @@
                 <w:szCs w:val="22"/>
                 <w:color w:val="000000"/>
               </w:rPr>
-              <w:t xml:space="preserve">32.815</w:t>
+              <w:t xml:space="preserve">37.539</w:t>
             </w:r>
             <w:r>
               <w:rPr>
@@ -650,7 +650,7 @@
                 <w:szCs w:val="22"/>
                 <w:color w:val="000000"/>
               </w:rPr>
-              <w:t xml:space="preserve">15.872</w:t>
+              <w:t xml:space="preserve">7.619</w:t>
             </w:r>
           </w:p>
         </w:tc>
@@ -664,7 +664,7 @@
         <w:tc>
           <w:tcPr>
             <w:tcBorders>
-              <w:bottom w:val="single" w:sz="8" w:space="0" w:color="BEBEBE"/>
+              <w:bottom w:val="none" w:sz="0" w:space="0" w:color="FFFFFF"/>
               <w:top w:val="none" w:sz="0" w:space="0" w:color="FFFFFF"/>
               <w:left w:val="none" w:sz="0" w:space="0" w:color="FFFFFF"/>
               <w:right w:val="none" w:sz="0" w:space="0" w:color="FFFFFF"/>
@@ -693,7 +693,7 @@
               <w:rPr>
                 <w:rFonts w:ascii="Times New Roman" w:hAnsi="Times New Roman" w:eastAsia="Times New Roman" w:cs="Times New Roman"/>
                 <w:i w:val="false"/>
-                <w:b w:val="true"/>
+                <w:b w:val="false"/>
                 <w:u w:val="none"/>
                 <w:sz w:val="22"/>
                 <w:szCs w:val="22"/>
@@ -704,20 +704,20 @@
               <w:rPr>
                 <w:rFonts w:ascii="Times New Roman" w:hAnsi="Times New Roman" w:eastAsia="Times New Roman" w:cs="Times New Roman"/>
                 <w:i w:val="false"/>
-                <w:b w:val="true"/>
-                <w:u w:val="none"/>
-                <w:sz w:val="22"/>
-                <w:szCs w:val="22"/>
-                <w:color w:val="000000"/>
-              </w:rPr>
-              <w:t xml:space="preserve">Use</w:t>
+                <w:b w:val="false"/>
+                <w:u w:val="none"/>
+                <w:sz w:val="22"/>
+                <w:szCs w:val="22"/>
+                <w:color w:val="000000"/>
+              </w:rPr>
+              <w:t xml:space="preserve">Other</w:t>
             </w:r>
           </w:p>
         </w:tc>
         <w:tc>
           <w:tcPr>
             <w:tcBorders>
-              <w:bottom w:val="single" w:sz="8" w:space="0" w:color="BEBEBE"/>
+              <w:bottom w:val="none" w:sz="0" w:space="0" w:color="FFFFFF"/>
               <w:top w:val="none" w:sz="0" w:space="0" w:color="FFFFFF"/>
               <w:left w:val="none" w:sz="0" w:space="0" w:color="FFFFFF"/>
               <w:right w:val="none" w:sz="0" w:space="0" w:color="FFFFFF"/>
@@ -763,7 +763,31 @@
                 <w:szCs w:val="22"/>
                 <w:color w:val="000000"/>
               </w:rPr>
-              <w:t xml:space="preserve"/>
+              <w:t xml:space="preserve">36.146</w:t>
+            </w:r>
+            <w:r>
+              <w:rPr>
+                <w:rFonts w:ascii="Times New Roman" w:hAnsi="Times New Roman" w:eastAsia="Times New Roman" w:cs="Times New Roman"/>
+                <w:i w:val="false"/>
+                <w:b w:val="false"/>
+                <w:u w:val="none"/>
+                <w:sz w:val="22"/>
+                <w:szCs w:val="22"/>
+                <w:color w:val="000000"/>
+              </w:rPr>
+              <w:t xml:space="preserve"> ± </w:t>
+            </w:r>
+            <w:r>
+              <w:rPr>
+                <w:rFonts w:ascii="Times New Roman" w:hAnsi="Times New Roman" w:eastAsia="Times New Roman" w:cs="Times New Roman"/>
+                <w:i w:val="false"/>
+                <w:b w:val="false"/>
+                <w:u w:val="none"/>
+                <w:sz w:val="22"/>
+                <w:szCs w:val="22"/>
+                <w:color w:val="000000"/>
+              </w:rPr>
+              <w:t xml:space="preserve">17.562</w:t>
             </w:r>
           </w:p>
         </w:tc>
@@ -778,7 +802,7 @@
           <w:tcPr>
             <w:tcBorders>
               <w:bottom w:val="none" w:sz="0" w:space="0" w:color="FFFFFF"/>
-              <w:top w:val="single" w:sz="8" w:space="0" w:color="BEBEBE"/>
+              <w:top w:val="none" w:sz="0" w:space="0" w:color="FFFFFF"/>
               <w:left w:val="none" w:sz="0" w:space="0" w:color="FFFFFF"/>
               <w:right w:val="none" w:sz="0" w:space="0" w:color="FFFFFF"/>
             </w:tcBorders>
@@ -823,7 +847,7 @@
                 <w:szCs w:val="22"/>
                 <w:color w:val="000000"/>
               </w:rPr>
-              <w:t xml:space="preserve">Insecticide</w:t>
+              <w:t xml:space="preserve">Thiol binding</w:t>
             </w:r>
           </w:p>
         </w:tc>
@@ -831,7 +855,7 @@
           <w:tcPr>
             <w:tcBorders>
               <w:bottom w:val="none" w:sz="0" w:space="0" w:color="FFFFFF"/>
-              <w:top w:val="single" w:sz="8" w:space="0" w:color="BEBEBE"/>
+              <w:top w:val="none" w:sz="0" w:space="0" w:color="FFFFFF"/>
               <w:left w:val="none" w:sz="0" w:space="0" w:color="FFFFFF"/>
               <w:right w:val="none" w:sz="0" w:space="0" w:color="FFFFFF"/>
             </w:tcBorders>
@@ -876,7 +900,7 @@
                 <w:szCs w:val="22"/>
                 <w:color w:val="000000"/>
               </w:rPr>
-              <w:t xml:space="preserve">43.867</w:t>
+              <w:t xml:space="preserve">34.479</w:t>
             </w:r>
             <w:r>
               <w:rPr>
@@ -900,7 +924,7 @@
                 <w:szCs w:val="22"/>
                 <w:color w:val="000000"/>
               </w:rPr>
-              <w:t xml:space="preserve">16.172</w:t>
+              <w:t xml:space="preserve">17.919</w:t>
             </w:r>
           </w:p>
         </w:tc>
@@ -960,7 +984,7 @@
                 <w:szCs w:val="22"/>
                 <w:color w:val="000000"/>
               </w:rPr>
-              <w:t xml:space="preserve">Metal</w:t>
+              <w:t xml:space="preserve">Multiple mechanisms</w:t>
             </w:r>
           </w:p>
         </w:tc>
@@ -1013,7 +1037,7 @@
                 <w:szCs w:val="22"/>
                 <w:color w:val="000000"/>
               </w:rPr>
-              <w:t xml:space="preserve">38.207</w:t>
+              <w:t xml:space="preserve">19.870</w:t>
             </w:r>
             <w:r>
               <w:rPr>
@@ -1037,7 +1061,7 @@
                 <w:szCs w:val="22"/>
                 <w:color w:val="000000"/>
               </w:rPr>
-              <w:t xml:space="preserve">19.071</w:t>
+              <w:t xml:space="preserve">NA</w:t>
             </w:r>
           </w:p>
         </w:tc>
@@ -1048,6 +1072,256 @@
           <w:trHeight w:val="360" w:hRule="auto"/>
         </w:trPr>
         body 8
+        <w:tc>
+          <w:tcPr>
+            <w:tcBorders>
+              <w:bottom w:val="single" w:sz="8" w:space="0" w:color="BEBEBE"/>
+              <w:top w:val="none" w:sz="0" w:space="0" w:color="FFFFFF"/>
+              <w:left w:val="none" w:sz="0" w:space="0" w:color="FFFFFF"/>
+              <w:right w:val="none" w:sz="0" w:space="0" w:color="FFFFFF"/>
+            </w:tcBorders>
+            <w:shd w:val="clear" w:color="auto" w:fill="FFFFFF"/>
+            <w:tcMar>
+              <w:top w:w="0" w:type="dxa"/>
+              <w:bottom w:w="0" w:type="dxa"/>
+              <w:left w:w="0" w:type="dxa"/>
+              <w:right w:w="0" w:type="dxa"/>
+            </w:tcMar>
+            <w:vAlign w:val="center"/>
+          </w:tcPr>
+          <w:p>
+            <w:pPr>
+              <w:pStyle w:val="Normal"/>
+              <w:jc w:val="center"/>
+              <w:pBdr>
+                <w:bottom w:val="none" w:sz="0" w:space="0" w:color="000000"/>
+                <w:top w:val="none" w:sz="0" w:space="0" w:color="000000"/>
+                <w:left w:val="none" w:sz="0" w:space="0" w:color="000000"/>
+                <w:right w:val="none" w:sz="0" w:space="0" w:color="000000"/>
+              </w:pBdr>
+              <w:spacing w:after="2" w:before="2" w:line="240"/>
+              <w:ind w:left="2" w:right="2" w:firstLine="0" w:firstLineChars="0"/>
+              <w:rPr>
+                <w:rFonts w:ascii="Times New Roman" w:hAnsi="Times New Roman" w:eastAsia="Times New Roman" w:cs="Times New Roman"/>
+                <w:i w:val="false"/>
+                <w:b w:val="true"/>
+                <w:u w:val="none"/>
+                <w:sz w:val="22"/>
+                <w:szCs w:val="22"/>
+                <w:color w:val="000000"/>
+              </w:rPr>
+            </w:pPr>
+            <w:r>
+              <w:rPr>
+                <w:rFonts w:ascii="Times New Roman" w:hAnsi="Times New Roman" w:eastAsia="Times New Roman" w:cs="Times New Roman"/>
+                <w:i w:val="false"/>
+                <w:b w:val="true"/>
+                <w:u w:val="none"/>
+                <w:sz w:val="22"/>
+                <w:szCs w:val="22"/>
+                <w:color w:val="000000"/>
+              </w:rPr>
+              <w:t xml:space="preserve">Use</w:t>
+            </w:r>
+          </w:p>
+        </w:tc>
+        <w:tc>
+          <w:tcPr>
+            <w:tcBorders>
+              <w:bottom w:val="single" w:sz="8" w:space="0" w:color="BEBEBE"/>
+              <w:top w:val="none" w:sz="0" w:space="0" w:color="FFFFFF"/>
+              <w:left w:val="none" w:sz="0" w:space="0" w:color="FFFFFF"/>
+              <w:right w:val="none" w:sz="0" w:space="0" w:color="FFFFFF"/>
+            </w:tcBorders>
+            <w:shd w:val="clear" w:color="auto" w:fill="FFFFFF"/>
+            <w:tcMar>
+              <w:top w:w="0" w:type="dxa"/>
+              <w:bottom w:w="0" w:type="dxa"/>
+              <w:left w:w="0" w:type="dxa"/>
+              <w:right w:w="0" w:type="dxa"/>
+            </w:tcMar>
+            <w:vAlign w:val="center"/>
+          </w:tcPr>
+          <w:p>
+            <w:pPr>
+              <w:pStyle w:val="Normal"/>
+              <w:jc w:val="center"/>
+              <w:pBdr>
+                <w:bottom w:val="none" w:sz="0" w:space="0" w:color="000000"/>
+                <w:top w:val="none" w:sz="0" w:space="0" w:color="000000"/>
+                <w:left w:val="none" w:sz="0" w:space="0" w:color="000000"/>
+                <w:right w:val="none" w:sz="0" w:space="0" w:color="000000"/>
+              </w:pBdr>
+              <w:spacing w:after="2" w:before="2" w:line="240"/>
+              <w:ind w:left="2" w:right="2" w:firstLine="0" w:firstLineChars="0"/>
+              <w:rPr>
+                <w:rFonts w:ascii="Times New Roman" w:hAnsi="Times New Roman" w:eastAsia="Times New Roman" w:cs="Times New Roman"/>
+                <w:i w:val="false"/>
+                <w:b w:val="false"/>
+                <w:u w:val="none"/>
+                <w:sz w:val="22"/>
+                <w:szCs w:val="22"/>
+                <w:color w:val="000000"/>
+              </w:rPr>
+            </w:pPr>
+            <w:r>
+              <w:rPr>
+                <w:rFonts w:ascii="Times New Roman" w:hAnsi="Times New Roman" w:eastAsia="Times New Roman" w:cs="Times New Roman"/>
+                <w:i w:val="false"/>
+                <w:b w:val="false"/>
+                <w:u w:val="none"/>
+                <w:sz w:val="22"/>
+                <w:szCs w:val="22"/>
+                <w:color w:val="000000"/>
+              </w:rPr>
+              <w:t xml:space="preserve"/>
+            </w:r>
+          </w:p>
+        </w:tc>
+      </w:tr>
+      <w:tr>
+        <w:trPr>
+          <w:cantSplit/>
+          <w:trHeight w:val="360" w:hRule="auto"/>
+        </w:trPr>
+        body 9
+        <w:tc>
+          <w:tcPr>
+            <w:tcBorders>
+              <w:bottom w:val="none" w:sz="0" w:space="0" w:color="FFFFFF"/>
+              <w:top w:val="single" w:sz="8" w:space="0" w:color="BEBEBE"/>
+              <w:left w:val="none" w:sz="0" w:space="0" w:color="FFFFFF"/>
+              <w:right w:val="none" w:sz="0" w:space="0" w:color="FFFFFF"/>
+            </w:tcBorders>
+            <w:shd w:val="clear" w:color="auto" w:fill="FFFFFF"/>
+            <w:tcMar>
+              <w:top w:w="0" w:type="dxa"/>
+              <w:bottom w:w="0" w:type="dxa"/>
+              <w:left w:w="0" w:type="dxa"/>
+              <w:right w:w="0" w:type="dxa"/>
+            </w:tcMar>
+            <w:vAlign w:val="center"/>
+          </w:tcPr>
+          <w:p>
+            <w:pPr>
+              <w:pStyle w:val="Normal"/>
+              <w:jc w:val="center"/>
+              <w:pBdr>
+                <w:bottom w:val="none" w:sz="0" w:space="0" w:color="000000"/>
+                <w:top w:val="none" w:sz="0" w:space="0" w:color="000000"/>
+                <w:left w:val="none" w:sz="0" w:space="0" w:color="000000"/>
+                <w:right w:val="none" w:sz="0" w:space="0" w:color="000000"/>
+              </w:pBdr>
+              <w:spacing w:after="2" w:before="2" w:line="240"/>
+              <w:ind w:left="2" w:right="2" w:firstLine="0" w:firstLineChars="0"/>
+              <w:rPr>
+                <w:rFonts w:ascii="Times New Roman" w:hAnsi="Times New Roman" w:eastAsia="Times New Roman" w:cs="Times New Roman"/>
+                <w:i w:val="false"/>
+                <w:b w:val="false"/>
+                <w:u w:val="none"/>
+                <w:sz w:val="22"/>
+                <w:szCs w:val="22"/>
+                <w:color w:val="000000"/>
+              </w:rPr>
+            </w:pPr>
+            <w:r>
+              <w:rPr>
+                <w:rFonts w:ascii="Times New Roman" w:hAnsi="Times New Roman" w:eastAsia="Times New Roman" w:cs="Times New Roman"/>
+                <w:i w:val="false"/>
+                <w:b w:val="false"/>
+                <w:u w:val="none"/>
+                <w:sz w:val="22"/>
+                <w:szCs w:val="22"/>
+                <w:color w:val="000000"/>
+              </w:rPr>
+              <w:t xml:space="preserve">Insecticide</w:t>
+            </w:r>
+          </w:p>
+        </w:tc>
+        <w:tc>
+          <w:tcPr>
+            <w:tcBorders>
+              <w:bottom w:val="none" w:sz="0" w:space="0" w:color="FFFFFF"/>
+              <w:top w:val="single" w:sz="8" w:space="0" w:color="BEBEBE"/>
+              <w:left w:val="none" w:sz="0" w:space="0" w:color="FFFFFF"/>
+              <w:right w:val="none" w:sz="0" w:space="0" w:color="FFFFFF"/>
+            </w:tcBorders>
+            <w:shd w:val="clear" w:color="auto" w:fill="FFFFFF"/>
+            <w:tcMar>
+              <w:top w:w="0" w:type="dxa"/>
+              <w:bottom w:w="0" w:type="dxa"/>
+              <w:left w:w="0" w:type="dxa"/>
+              <w:right w:w="0" w:type="dxa"/>
+            </w:tcMar>
+            <w:vAlign w:val="center"/>
+          </w:tcPr>
+          <w:p>
+            <w:pPr>
+              <w:pStyle w:val="Normal"/>
+              <w:jc w:val="center"/>
+              <w:pBdr>
+                <w:bottom w:val="none" w:sz="0" w:space="0" w:color="000000"/>
+                <w:top w:val="none" w:sz="0" w:space="0" w:color="000000"/>
+                <w:left w:val="none" w:sz="0" w:space="0" w:color="000000"/>
+                <w:right w:val="none" w:sz="0" w:space="0" w:color="000000"/>
+              </w:pBdr>
+              <w:spacing w:after="2" w:before="2" w:line="240"/>
+              <w:ind w:left="2" w:right="2" w:firstLine="0" w:firstLineChars="0"/>
+              <w:rPr>
+                <w:rFonts w:ascii="Times New Roman" w:hAnsi="Times New Roman" w:eastAsia="Times New Roman" w:cs="Times New Roman"/>
+                <w:i w:val="false"/>
+                <w:b w:val="false"/>
+                <w:u w:val="none"/>
+                <w:sz w:val="22"/>
+                <w:szCs w:val="22"/>
+                <w:color w:val="000000"/>
+              </w:rPr>
+            </w:pPr>
+            <w:r>
+              <w:rPr>
+                <w:rFonts w:ascii="Times New Roman" w:hAnsi="Times New Roman" w:eastAsia="Times New Roman" w:cs="Times New Roman"/>
+                <w:i w:val="false"/>
+                <w:b w:val="false"/>
+                <w:u w:val="none"/>
+                <w:sz w:val="22"/>
+                <w:szCs w:val="22"/>
+                <w:color w:val="000000"/>
+              </w:rPr>
+              <w:t xml:space="preserve">43.867</w:t>
+            </w:r>
+            <w:r>
+              <w:rPr>
+                <w:rFonts w:ascii="Times New Roman" w:hAnsi="Times New Roman" w:eastAsia="Times New Roman" w:cs="Times New Roman"/>
+                <w:i w:val="false"/>
+                <w:b w:val="false"/>
+                <w:u w:val="none"/>
+                <w:sz w:val="22"/>
+                <w:szCs w:val="22"/>
+                <w:color w:val="000000"/>
+              </w:rPr>
+              <w:t xml:space="preserve"> ± </w:t>
+            </w:r>
+            <w:r>
+              <w:rPr>
+                <w:rFonts w:ascii="Times New Roman" w:hAnsi="Times New Roman" w:eastAsia="Times New Roman" w:cs="Times New Roman"/>
+                <w:i w:val="false"/>
+                <w:b w:val="false"/>
+                <w:u w:val="none"/>
+                <w:sz w:val="22"/>
+                <w:szCs w:val="22"/>
+                <w:color w:val="000000"/>
+              </w:rPr>
+              <w:t xml:space="preserve">16.172</w:t>
+            </w:r>
+          </w:p>
+        </w:tc>
+      </w:tr>
+      <w:tr>
+        <w:trPr>
+          <w:cantSplit/>
+          <w:trHeight w:val="360" w:hRule="auto"/>
+        </w:trPr>
+        body10
         <w:tc>
           <w:tcPr>
             <w:tcBorders>
@@ -1097,7 +1371,7 @@
                 <w:szCs w:val="22"/>
                 <w:color w:val="000000"/>
               </w:rPr>
-              <w:t xml:space="preserve">Herbicide</w:t>
+              <w:t xml:space="preserve">Metal</w:t>
             </w:r>
           </w:p>
         </w:tc>
@@ -1150,7 +1424,7 @@
                 <w:szCs w:val="22"/>
                 <w:color w:val="000000"/>
               </w:rPr>
-              <w:t xml:space="preserve">33.533</w:t>
+              <w:t xml:space="preserve">38.207</w:t>
             </w:r>
             <w:r>
               <w:rPr>
@@ -1174,7 +1448,7 @@
                 <w:szCs w:val="22"/>
                 <w:color w:val="000000"/>
               </w:rPr>
-              <w:t xml:space="preserve">5.415</w:t>
+              <w:t xml:space="preserve">19.071</w:t>
             </w:r>
           </w:p>
         </w:tc>
@@ -1184,7 +1458,7 @@
           <w:cantSplit/>
           <w:trHeight w:val="360" w:hRule="auto"/>
         </w:trPr>
-        body 9
+        body11
         <w:tc>
           <w:tcPr>
             <w:tcBorders>
@@ -1234,7 +1508,7 @@
                 <w:szCs w:val="22"/>
                 <w:color w:val="000000"/>
               </w:rPr>
-              <w:t xml:space="preserve">Flame Retardant</w:t>
+              <w:t xml:space="preserve">Herbicide</w:t>
             </w:r>
           </w:p>
         </w:tc>
@@ -1287,7 +1561,7 @@
                 <w:szCs w:val="22"/>
                 <w:color w:val="000000"/>
               </w:rPr>
-              <w:t xml:space="preserve">31.525</w:t>
+              <w:t xml:space="preserve">33.533</w:t>
             </w:r>
             <w:r>
               <w:rPr>
@@ -1311,7 +1585,7 @@
                 <w:szCs w:val="22"/>
                 <w:color w:val="000000"/>
               </w:rPr>
-              <w:t xml:space="preserve">8.974</w:t>
+              <w:t xml:space="preserve">5.415</w:t>
             </w:r>
           </w:p>
         </w:tc>
@@ -1321,7 +1595,144 @@
           <w:cantSplit/>
           <w:trHeight w:val="360" w:hRule="auto"/>
         </w:trPr>
-        body10
+        body12
+        <w:tc>
+          <w:tcPr>
+            <w:tcBorders>
+              <w:bottom w:val="none" w:sz="0" w:space="0" w:color="FFFFFF"/>
+              <w:top w:val="none" w:sz="0" w:space="0" w:color="FFFFFF"/>
+              <w:left w:val="none" w:sz="0" w:space="0" w:color="FFFFFF"/>
+              <w:right w:val="none" w:sz="0" w:space="0" w:color="FFFFFF"/>
+            </w:tcBorders>
+            <w:shd w:val="clear" w:color="auto" w:fill="FFFFFF"/>
+            <w:tcMar>
+              <w:top w:w="0" w:type="dxa"/>
+              <w:bottom w:w="0" w:type="dxa"/>
+              <w:left w:w="0" w:type="dxa"/>
+              <w:right w:w="0" w:type="dxa"/>
+            </w:tcMar>
+            <w:vAlign w:val="center"/>
+          </w:tcPr>
+          <w:p>
+            <w:pPr>
+              <w:pStyle w:val="Normal"/>
+              <w:jc w:val="center"/>
+              <w:pBdr>
+                <w:bottom w:val="none" w:sz="0" w:space="0" w:color="000000"/>
+                <w:top w:val="none" w:sz="0" w:space="0" w:color="000000"/>
+                <w:left w:val="none" w:sz="0" w:space="0" w:color="000000"/>
+                <w:right w:val="none" w:sz="0" w:space="0" w:color="000000"/>
+              </w:pBdr>
+              <w:spacing w:after="2" w:before="2" w:line="240"/>
+              <w:ind w:left="2" w:right="2" w:firstLine="0" w:firstLineChars="0"/>
+              <w:rPr>
+                <w:rFonts w:ascii="Times New Roman" w:hAnsi="Times New Roman" w:eastAsia="Times New Roman" w:cs="Times New Roman"/>
+                <w:i w:val="false"/>
+                <w:b w:val="false"/>
+                <w:u w:val="none"/>
+                <w:sz w:val="22"/>
+                <w:szCs w:val="22"/>
+                <w:color w:val="000000"/>
+              </w:rPr>
+            </w:pPr>
+            <w:r>
+              <w:rPr>
+                <w:rFonts w:ascii="Times New Roman" w:hAnsi="Times New Roman" w:eastAsia="Times New Roman" w:cs="Times New Roman"/>
+                <w:i w:val="false"/>
+                <w:b w:val="false"/>
+                <w:u w:val="none"/>
+                <w:sz w:val="22"/>
+                <w:szCs w:val="22"/>
+                <w:color w:val="000000"/>
+              </w:rPr>
+              <w:t xml:space="preserve">Flame Retardant</w:t>
+            </w:r>
+          </w:p>
+        </w:tc>
+        <w:tc>
+          <w:tcPr>
+            <w:tcBorders>
+              <w:bottom w:val="none" w:sz="0" w:space="0" w:color="FFFFFF"/>
+              <w:top w:val="none" w:sz="0" w:space="0" w:color="FFFFFF"/>
+              <w:left w:val="none" w:sz="0" w:space="0" w:color="FFFFFF"/>
+              <w:right w:val="none" w:sz="0" w:space="0" w:color="FFFFFF"/>
+            </w:tcBorders>
+            <w:shd w:val="clear" w:color="auto" w:fill="FFFFFF"/>
+            <w:tcMar>
+              <w:top w:w="0" w:type="dxa"/>
+              <w:bottom w:w="0" w:type="dxa"/>
+              <w:left w:w="0" w:type="dxa"/>
+              <w:right w:w="0" w:type="dxa"/>
+            </w:tcMar>
+            <w:vAlign w:val="center"/>
+          </w:tcPr>
+          <w:p>
+            <w:pPr>
+              <w:pStyle w:val="Normal"/>
+              <w:jc w:val="center"/>
+              <w:pBdr>
+                <w:bottom w:val="none" w:sz="0" w:space="0" w:color="000000"/>
+                <w:top w:val="none" w:sz="0" w:space="0" w:color="000000"/>
+                <w:left w:val="none" w:sz="0" w:space="0" w:color="000000"/>
+                <w:right w:val="none" w:sz="0" w:space="0" w:color="000000"/>
+              </w:pBdr>
+              <w:spacing w:after="2" w:before="2" w:line="240"/>
+              <w:ind w:left="2" w:right="2" w:firstLine="0" w:firstLineChars="0"/>
+              <w:rPr>
+                <w:rFonts w:ascii="Times New Roman" w:hAnsi="Times New Roman" w:eastAsia="Times New Roman" w:cs="Times New Roman"/>
+                <w:i w:val="false"/>
+                <w:b w:val="false"/>
+                <w:u w:val="none"/>
+                <w:sz w:val="22"/>
+                <w:szCs w:val="22"/>
+                <w:color w:val="000000"/>
+              </w:rPr>
+            </w:pPr>
+            <w:r>
+              <w:rPr>
+                <w:rFonts w:ascii="Times New Roman" w:hAnsi="Times New Roman" w:eastAsia="Times New Roman" w:cs="Times New Roman"/>
+                <w:i w:val="false"/>
+                <w:b w:val="false"/>
+                <w:u w:val="none"/>
+                <w:sz w:val="22"/>
+                <w:szCs w:val="22"/>
+                <w:color w:val="000000"/>
+              </w:rPr>
+              <w:t xml:space="preserve">31.525</w:t>
+            </w:r>
+            <w:r>
+              <w:rPr>
+                <w:rFonts w:ascii="Times New Roman" w:hAnsi="Times New Roman" w:eastAsia="Times New Roman" w:cs="Times New Roman"/>
+                <w:i w:val="false"/>
+                <w:b w:val="false"/>
+                <w:u w:val="none"/>
+                <w:sz w:val="22"/>
+                <w:szCs w:val="22"/>
+                <w:color w:val="000000"/>
+              </w:rPr>
+              <w:t xml:space="preserve"> ± </w:t>
+            </w:r>
+            <w:r>
+              <w:rPr>
+                <w:rFonts w:ascii="Times New Roman" w:hAnsi="Times New Roman" w:eastAsia="Times New Roman" w:cs="Times New Roman"/>
+                <w:i w:val="false"/>
+                <w:b w:val="false"/>
+                <w:u w:val="none"/>
+                <w:sz w:val="22"/>
+                <w:szCs w:val="22"/>
+                <w:color w:val="000000"/>
+              </w:rPr>
+              <w:t xml:space="preserve">8.974</w:t>
+            </w:r>
+          </w:p>
+        </w:tc>
+      </w:tr>
+      <w:tr>
+        <w:trPr>
+          <w:cantSplit/>
+          <w:trHeight w:val="360" w:hRule="auto"/>
+        </w:trPr>
+        body13
         <w:tc>
           <w:tcPr>
             <w:tcBorders>

</xml_diff>